<commit_message>
feat: refine resume and case study copy to emphasize platform ownership and cross-functional delivery
Co-Authored-By: Claude Sonnet 4.6 <noreply@anthropic.com>
</commit_message>
<xml_diff>
--- a/misc/Mike Tullo Resume 2025.docx
+++ b/misc/Mike Tullo Resume 2025.docx
@@ -461,14 +461,26 @@
           <w:szCs w:val="22"/>
         </w:rPr>
       </w:pPr>
-      <w:r>
-        <w:rPr>
-          <w:sz w:val="22"/>
-          <w:szCs w:val="22"/>
-          <w:rtl w:val="0"/>
-        </w:rPr>
-        <w:t xml:space="preserve">Spearheaded the YaleSites platform as Product Manager, orchestrating cross-functional teams of engineers, designers, and project managers to deliver a user-centric web platform used by 1,500+ Yale websites</w:t>
-      </w:r>
+      <w:del w:id="1" w:author="Claude" w:date="2026-04-03T00:00:00Z">
+        <w:r>
+          <w:rPr>
+            <w:sz w:val="22"/>
+            <w:szCs w:val="22"/>
+            <w:rtl w:val="0"/>
+          </w:rPr>
+          <w:delText xml:space="preserve">Spearheaded the YaleSites platform as Product Manager, orchestrating cross-functional teams of engineers, designers, and project managers to deliver a user-centric web platform used by 1,500+ Yale websites</w:delText>
+        </w:r>
+      </w:del>
+      <w:ins w:id="2" w:author="Claude" w:date="2026-04-03T00:00:00Z">
+        <w:r>
+          <w:rPr>
+            <w:sz w:val="22"/>
+            <w:szCs w:val="22"/>
+            <w:rtl w:val="0"/>
+          </w:rPr>
+          <w:t xml:space="preserve">Own the product roadmap and quarterly governance for YaleSites — a multi-tenant live platform serving 2,400+ active users across 449 sites at Yale. Facilitate a 10–12 member steering committee of university leaders to align service priorities across a decentralized institution with no central mandate.</w:t>
+        </w:r>
+      </w:ins>
     </w:p>
     <w:p>
       <w:pPr>
@@ -484,14 +496,26 @@
           <w:szCs w:val="22"/>
         </w:rPr>
       </w:pPr>
-      <w:r>
-        <w:rPr>
-          <w:sz w:val="22"/>
-          <w:szCs w:val="22"/>
-          <w:rtl w:val="0"/>
-        </w:rPr>
-        <w:t xml:space="preserve">Led feature prioritization and roadmap development based on user research insights, balancing stakeholder needs with technical constraints</w:t>
-      </w:r>
+      <w:del w:id="3" w:author="Claude" w:date="2026-04-03T00:00:00Z">
+        <w:r>
+          <w:rPr>
+            <w:sz w:val="22"/>
+            <w:szCs w:val="22"/>
+            <w:rtl w:val="0"/>
+          </w:rPr>
+          <w:delText xml:space="preserve">Led feature prioritization and roadmap development based on user research insights, balancing stakeholder needs with technical constraints</w:delText>
+        </w:r>
+      </w:del>
+      <w:ins w:id="4" w:author="Claude" w:date="2026-04-03T00:00:00Z">
+        <w:r>
+          <w:rPr>
+            <w:sz w:val="22"/>
+            <w:szCs w:val="22"/>
+            <w:rtl w:val="0"/>
+          </w:rPr>
+          <w:t xml:space="preserve">Manage a collaborative vendor model where Yale units bring outside development partners to build platform features — scoping requirements to ensure work extends across the entire service community, not just the sponsoring unit. Shipped 3 major unit-vendor collaborations as platform-wide releases in 2025.</w:t>
+        </w:r>
+      </w:ins>
     </w:p>
     <w:p>
       <w:pPr>
@@ -507,14 +531,26 @@
           <w:szCs w:val="22"/>
         </w:rPr>
       </w:pPr>
-      <w:r>
-        <w:rPr>
-          <w:sz w:val="22"/>
-          <w:szCs w:val="22"/>
-          <w:rtl w:val="0"/>
-        </w:rPr>
-        <w:t xml:space="preserve">Managed product backlog in Jira, efficiently organizing user stories, bugs, and feature requests to maximize team productivity</w:t>
-      </w:r>
+      <w:del w:id="5" w:author="Claude" w:date="2026-04-03T00:00:00Z">
+        <w:r>
+          <w:rPr>
+            <w:sz w:val="22"/>
+            <w:szCs w:val="22"/>
+            <w:rtl w:val="0"/>
+          </w:rPr>
+          <w:delText xml:space="preserve">Managed product backlog in Jira, efficiently organizing user stories, bugs, and feature requests to maximize team productivity</w:delText>
+        </w:r>
+      </w:del>
+      <w:ins w:id="6" w:author="Claude" w:date="2026-04-03T00:00:00Z">
+        <w:r>
+          <w:rPr>
+            <w:sz w:val="22"/>
+            <w:szCs w:val="22"/>
+            <w:rtl w:val="0"/>
+          </w:rPr>
+          <w:t xml:space="preserve">Run the weekly agile development loop — backlog triage, ticket writing, sprint execution, QA, and release communication — resulting in 5 major platform releases and 138 bugs resolved in 2025.</w:t>
+        </w:r>
+      </w:ins>
     </w:p>
     <w:p>
       <w:pPr>
@@ -530,14 +566,26 @@
           <w:szCs w:val="22"/>
         </w:rPr>
       </w:pPr>
-      <w:r>
-        <w:rPr>
-          <w:sz w:val="22"/>
-          <w:szCs w:val="22"/>
-          <w:rtl w:val="0"/>
-        </w:rPr>
-        <w:t xml:space="preserve">Collaborated with multiple academic and administrative units across Yale to identify requirements, select and hire development vendors to contribute features back to the open-source platform, creating a sustainable model for community-driven innovation</w:t>
-      </w:r>
+      <w:del w:id="7" w:author="Claude" w:date="2026-04-03T00:00:00Z">
+        <w:r>
+          <w:rPr>
+            <w:sz w:val="22"/>
+            <w:szCs w:val="22"/>
+            <w:rtl w:val="0"/>
+          </w:rPr>
+          <w:delText xml:space="preserve">Collaborated with multiple academic and administrative units across Yale to identify requirements, select and hire development vendors to contribute features back to the open-source platform, creating a sustainable model for community-driven innovation</w:delText>
+        </w:r>
+      </w:del>
+      <w:ins w:id="8" w:author="Claude" w:date="2026-04-03T00:00:00Z">
+        <w:r>
+          <w:rPr>
+            <w:sz w:val="22"/>
+            <w:szCs w:val="22"/>
+            <w:rtl w:val="0"/>
+          </w:rPr>
+          <w:t xml:space="preserve">Oversaw product requirements for YaleSites Beacon — an AI-powered assistant built on the shared platform infrastructure. Balanced innovation with platform governance to ensure the capability could extend to 2,400+ users without fragmenting the platform experience or introducing service inconsistency.</w:t>
+        </w:r>
+      </w:ins>
     </w:p>
     <w:p>
       <w:pPr>
@@ -720,14 +768,26 @@
           <w:szCs w:val="22"/>
         </w:rPr>
       </w:pPr>
-      <w:r>
-        <w:rPr>
-          <w:sz w:val="22"/>
-          <w:szCs w:val="22"/>
-          <w:rtl w:val="0"/>
-        </w:rPr>
-        <w:t xml:space="preserve">Designed the experience and visual design for the Yale SSO and account management page used by everyone in the Yale community daily.</w:t>
-      </w:r>
+      <w:del w:id="9" w:author="Claude" w:date="2026-04-03T00:00:00Z">
+        <w:r>
+          <w:rPr>
+            <w:sz w:val="22"/>
+            <w:szCs w:val="22"/>
+            <w:rtl w:val="0"/>
+          </w:rPr>
+          <w:delText xml:space="preserve">Designed the experience and visual design for the Yale SSO and account management page used by everyone in the Yale community daily.</w:delText>
+        </w:r>
+      </w:del>
+      <w:ins w:id="10" w:author="Claude" w:date="2026-04-03T00:00:00Z">
+        <w:r>
+          <w:rPr>
+            <w:sz w:val="22"/>
+            <w:szCs w:val="22"/>
+            <w:rtl w:val="0"/>
+          </w:rPr>
+          <w:t xml:space="preserve">Redesigned Yale’s Single Sign-On system — the most-visited page at Yale, used by 35,000+ community members daily — improving accessibility to WCAG 2.1 AA, reducing password reset steps from 7 to 4, and significantly reducing help desk login escalations.</w:t>
+        </w:r>
+      </w:ins>
       <w:r>
         <w:rPr>
           <w:rtl w:val="0"/>
@@ -748,14 +808,26 @@
           <w:szCs w:val="22"/>
         </w:rPr>
       </w:pPr>
-      <w:r>
-        <w:rPr>
-          <w:sz w:val="22"/>
-          <w:szCs w:val="22"/>
-          <w:rtl w:val="0"/>
-        </w:rPr>
-        <w:t xml:space="preserve">Designed and delivered the Yale MFA Opt-in experience for the Yale community, which lowered the number of compromised accounts by 100%.</w:t>
-      </w:r>
+      <w:del w:id="11" w:author="Claude" w:date="2026-04-03T00:00:00Z">
+        <w:r>
+          <w:rPr>
+            <w:sz w:val="22"/>
+            <w:szCs w:val="22"/>
+            <w:rtl w:val="0"/>
+          </w:rPr>
+          <w:delText xml:space="preserve">Designed and delivered the Yale MFA Opt-in experience for the Yale community, which lowered the number of compromised accounts by 100%.</w:delText>
+        </w:r>
+      </w:del>
+      <w:ins w:id="12" w:author="Claude" w:date="2026-04-03T00:00:00Z">
+        <w:r>
+          <w:rPr>
+            <w:sz w:val="22"/>
+            <w:szCs w:val="22"/>
+            <w:rtl w:val="0"/>
+          </w:rPr>
+          <w:t xml:space="preserve">Owned end-to-end flow design and rollout strategy for Yale’s two-factor authentication infrastructure — driving adoption across 20,000+ community members through cross-functional execution with security and engineering teams, reducing compromised NetID incidents to zero since launch.</w:t>
+        </w:r>
+      </w:ins>
       <w:r>
         <w:rPr>
           <w:b w:val="1"/>
@@ -1385,14 +1457,26 @@
           <w:vertAlign w:val="baseline"/>
         </w:rPr>
       </w:pPr>
-      <w:r>
-        <w:rPr>
-          <w:sz w:val="22"/>
-          <w:szCs w:val="22"/>
-          <w:rtl w:val="0"/>
-        </w:rPr>
-        <w:t xml:space="preserve">Product Management, Roadmap Development, Feature Prioritization, User Segmentation, A/B Testing, Data Analysis, Stakeholder Management, User Research, Metrics Definition, Jira, Confluence, Figma, Airtable, Drupal CMS, HTML/CSS, JavaScript, Cross-functional Leadership, Team Mentorship, Vendor Management, Open Source Development</w:t>
-      </w:r>
+      <w:del w:id="13" w:author="Claude" w:date="2026-04-03T00:00:00Z">
+        <w:r>
+          <w:rPr>
+            <w:sz w:val="22"/>
+            <w:szCs w:val="22"/>
+            <w:rtl w:val="0"/>
+          </w:rPr>
+          <w:delText xml:space="preserve">Product Management, Roadmap Development, Feature Prioritization, User Segmentation, A/B Testing, Data Analysis, Stakeholder Management, User Research, Metrics Definition, Jira, Confluence, Figma, Airtable, Drupal CMS, HTML/CSS, JavaScript, Cross-functional Leadership, Team Mentorship, Vendor Management, Open Source Development</w:delText>
+        </w:r>
+      </w:del>
+      <w:ins w:id="14" w:author="Claude" w:date="2026-04-03T00:00:00Z">
+        <w:r>
+          <w:rPr>
+            <w:sz w:val="22"/>
+            <w:szCs w:val="22"/>
+            <w:rtl w:val="0"/>
+          </w:rPr>
+          <w:t xml:space="preserve">Product Management, Roadmap Development, Feature Prioritization, User Segmentation, A/B Testing, Data Analysis, Stakeholder Management, User Research, Metrics Definition, Live Operations, Distributed Platform Ownership, Jira, Confluence, Airtable, Drupal CMS, JavaScript, Cross-functional Leadership, Team Mentorship, Vendor Management, Open Source Development</w:t>
+        </w:r>
+      </w:ins>
       <w:r>
         <w:rPr>
           <w:rtl w:val="0"/>

</xml_diff>